<commit_message>
Closure audit: structured logs, HTTPS, Grafana, urgency mix, browser tests
Final audit of the whole plan; the missing items that can be built here
(decision 0009):
- C4-06 structured logs: JSON lines with the case id for every service
  (service_metrics.logs); event consumers run inside case_context.
- C4-03 HTTPS: nginx on 443 with TLS 1.2/1.3 and security headers; port 80
  redirects; a self-signed certificate is made at start if none is mounted.
- Grafana in the monitoring profile with a provisioned dashboard.
- Section 11: the simulator's default urgency mix is the training data's.
- Section 14: Playwright browser tests (web/e2e) in Chrome; a CI job.
Also: the demo seed restores the deadlock example; configuration tests for
Prometheus, Grafana and nginx; coverage figures corrected (94.3% statements,
86.5% branches); acceptance checklist and report updated.

Co-Authored-By: Claude Opus 5.5 <noreply@anthropic.com>
</commit_message>
<xml_diff>
--- a/docs/report/AdaptiveCare-Flow-Report.docx
+++ b/docs/report/AdaptiveCare-Flow-Report.docx
@@ -382,7 +382,7 @@
         <w:t xml:space="preserve"> </w:t>
       </w:r>
       <w:r>
-        <w:t xml:space="preserve">interval in 92 of 100 experiments (target 90); 92.8% test coverage over 652 automated tests.</w:t>
+        <w:t xml:space="preserve">interval in 92 of 100 experiments (target 90); 94.3% statement coverage over 664 automated tests.</w:t>
       </w:r>
       <w:r>
         <w:t xml:space="preserve"> </w:t>
@@ -11868,6 +11868,34 @@
           <w:bCs/>
           <w:b/>
         </w:rPr>
+        <w:t xml:space="preserve">Transport</w:t>
+      </w:r>
+      <w:r>
+        <w:t xml:space="preserve"> </w:t>
+      </w:r>
+      <w:r>
+        <w:t xml:space="preserve">— the web server serves HTTPS only (TLS 1.2/1.3, HSTS and other security headers);</w:t>
+      </w:r>
+      <w:r>
+        <w:t xml:space="preserve"> </w:t>
+      </w:r>
+      <w:r>
+        <w:t xml:space="preserve">plain HTTP redirects (decision 0009).</w:t>
+      </w:r>
+    </w:p>
+    <w:p>
+      <w:pPr>
+        <w:numPr>
+          <w:ilvl w:val="0"/>
+          <w:numId w:val="1012"/>
+        </w:numPr>
+        <w:pStyle w:val="Compact"/>
+      </w:pPr>
+      <w:r>
+        <w:rPr>
+          <w:bCs/>
+          <w:b/>
+        </w:rPr>
         <w:t xml:space="preserve">Scans</w:t>
       </w:r>
       <w:r>
@@ -25000,7 +25028,13 @@
         <w:t xml:space="preserve"> </w:t>
       </w:r>
       <w:r>
-        <w:t xml:space="preserve">the urgency mix of arriving patients; staff per role and the cost weight of each role; deadline</w:t>
+        <w:t xml:space="preserve">the urgency mix of arriving patients (since Closure, the class shares of the model’s</w:t>
+      </w:r>
+      <w:r>
+        <w:t xml:space="preserve"> </w:t>
+      </w:r>
+      <w:r>
+        <w:t xml:space="preserve">training data by default); staff per role and the cost weight of each role; deadline</w:t>
       </w:r>
       <w:r>
         <w:t xml:space="preserve"> </w:t>
@@ -30297,7 +30331,7 @@
         <w:t xml:space="preserve"> </w:t>
       </w:r>
       <w:r>
-        <w:t xml:space="preserve">Prometheus is an optional Compose profile. It does not scrape engines, because finding them needs</w:t>
+        <w:t xml:space="preserve">Prometheus (with Grafana, added in Closure) is an optional Compose profile. It does not scrape engines, because finding them needs</w:t>
       </w:r>
       <w:r>
         <w:t xml:space="preserve"> </w:t>
@@ -33259,18 +33293,18 @@
               <w:jc w:val="left"/>
             </w:pPr>
             <w:r>
-              <w:t xml:space="preserve">in-process system tests, every message delivered twice</w:t>
-            </w:r>
-          </w:p>
-        </w:tc>
-        <w:tc>
-          <w:p>
-            <w:pPr>
-              <w:pStyle w:val="Compact"/>
-              <w:jc w:val="left"/>
-            </w:pPr>
-            <w:r>
-              <w:t xml:space="preserve">8 system tests pass; the Compose and RabbitMQ run is open</w:t>
+              <w:t xml:space="preserve">in-process system tests, every message delivered twice; Playwright in Chrome against the running platform</w:t>
+            </w:r>
+          </w:p>
+        </w:tc>
+        <w:tc>
+          <w:p>
+            <w:pPr>
+              <w:pStyle w:val="Compact"/>
+              <w:jc w:val="left"/>
+            </w:pPr>
+            <w:r>
+              <w:t xml:space="preserve">8 system tests and 3 browser tests pass; the Compose and RabbitMQ run is open</w:t>
             </w:r>
           </w:p>
         </w:tc>
@@ -33663,7 +33697,7 @@
               <w:jc w:val="left"/>
             </w:pPr>
             <w:r>
-              <w:t xml:space="preserve">639 Python and 13 web tests pass</w:t>
+              <w:t xml:space="preserve">648 Python, 13 web unit and 3 browser tests pass</w:t>
             </w:r>
           </w:p>
         </w:tc>
@@ -34208,7 +34242,7 @@
         <w:t xml:space="preserve"> </w:t>
       </w:r>
       <w:r>
-        <w:t xml:space="preserve">the executed count larger: 639 Python tests and 13 web tests run in the final suite.</w:t>
+        <w:t xml:space="preserve">the executed count larger: 648 Python tests, 13 web unit tests and 3 browser tests run in the final suite.</w:t>
       </w:r>
     </w:p>
     <w:bookmarkEnd w:id="183"/>
@@ -34242,14 +34276,6 @@
       </w:r>
       <w:r>
         <w:t xml:space="preserve">reported (NFR-MNT-01). Table 15.3 gives both for every package.</w:t>
-      </w:r>
-    </w:p>
-    <w:p>
-      <w:pPr>
-        <w:pStyle w:val="TableCaption"/>
-      </w:pPr>
-      <w:r>
-        <w:t xml:space="preserve">Table 15.3 — Coverage by package (core packages in bold).</w:t>
       </w:r>
     </w:p>
     <w:tbl>
@@ -34257,7 +34283,6 @@
         <w:tblStyle w:val="Table"/>
         <w:tblW w:type="pct" w:w="0.0"/>
         <w:tblLook w:firstRow="1" w:lastRow="0" w:firstColumn="0" w:lastColumn="0" w:noHBand="0" w:noVBand="0" w:val="0020"/>
-        <w:tblCaption w:val="Table 15.3 — Coverage by package (core packages in bold)."/>
       </w:tblPr>
       <w:tblGrid/>
       <w:tr>
@@ -34425,7 +34450,7 @@
               <w:jc w:val="right"/>
             </w:pPr>
             <w:r>
-              <w:t xml:space="preserve">608</w:t>
+              <w:t xml:space="preserve">618</w:t>
             </w:r>
           </w:p>
         </w:tc>
@@ -34440,7 +34465,7 @@
                 <w:bCs/>
                 <w:b/>
               </w:rPr>
-              <w:t xml:space="preserve">92.9%</w:t>
+              <w:t xml:space="preserve">92.6%</w:t>
             </w:r>
           </w:p>
         </w:tc>
@@ -34451,7 +34476,7 @@
               <w:jc w:val="right"/>
             </w:pPr>
             <w:r>
-              <w:t xml:space="preserve">81.8%</w:t>
+              <w:t xml:space="preserve">80.0%</w:t>
             </w:r>
           </w:p>
         </w:tc>
@@ -34475,7 +34500,7 @@
               <w:jc w:val="right"/>
             </w:pPr>
             <w:r>
-              <w:t xml:space="preserve">662</w:t>
+              <w:t xml:space="preserve">671</w:t>
             </w:r>
           </w:p>
         </w:tc>
@@ -34501,7 +34526,7 @@
               <w:jc w:val="right"/>
             </w:pPr>
             <w:r>
-              <w:t xml:space="preserve">91.7%</w:t>
+              <w:t xml:space="preserve">91.8%</w:t>
             </w:r>
           </w:p>
         </w:tc>
@@ -34525,7 +34550,7 @@
               <w:jc w:val="right"/>
             </w:pPr>
             <w:r>
-              <w:t xml:space="preserve">572</w:t>
+              <w:t xml:space="preserve">579</w:t>
             </w:r>
           </w:p>
         </w:tc>
@@ -34536,7 +34561,7 @@
               <w:jc w:val="right"/>
             </w:pPr>
             <w:r>
-              <w:t xml:space="preserve">97.0%</w:t>
+              <w:t xml:space="preserve">97.1%</w:t>
             </w:r>
           </w:p>
         </w:tc>
@@ -34571,7 +34596,7 @@
               <w:jc w:val="right"/>
             </w:pPr>
             <w:r>
-              <w:t xml:space="preserve">296</w:t>
+              <w:t xml:space="preserve">300</w:t>
             </w:r>
           </w:p>
         </w:tc>
@@ -34582,7 +34607,7 @@
               <w:jc w:val="right"/>
             </w:pPr>
             <w:r>
-              <w:t xml:space="preserve">97.6%</w:t>
+              <w:t xml:space="preserve">97.7%</w:t>
             </w:r>
           </w:p>
         </w:tc>
@@ -34755,7 +34780,7 @@
               <w:jc w:val="right"/>
             </w:pPr>
             <w:r>
-              <w:t xml:space="preserve">155</w:t>
+              <w:t xml:space="preserve">158</w:t>
             </w:r>
           </w:p>
         </w:tc>
@@ -34766,7 +34791,7 @@
               <w:jc w:val="right"/>
             </w:pPr>
             <w:r>
-              <w:t xml:space="preserve">91.6%</w:t>
+              <w:t xml:space="preserve">91.8%</w:t>
             </w:r>
           </w:p>
         </w:tc>
@@ -34801,7 +34826,7 @@
               <w:jc w:val="right"/>
             </w:pPr>
             <w:r>
-              <w:t xml:space="preserve">84</w:t>
+              <w:t xml:space="preserve">87</w:t>
             </w:r>
           </w:p>
         </w:tc>
@@ -34812,7 +34837,7 @@
               <w:jc w:val="right"/>
             </w:pPr>
             <w:r>
-              <w:t xml:space="preserve">97.6%</w:t>
+              <w:t xml:space="preserve">97.7%</w:t>
             </w:r>
           </w:p>
         </w:tc>
@@ -34847,7 +34872,7 @@
               <w:jc w:val="right"/>
             </w:pPr>
             <w:r>
-              <w:t xml:space="preserve">92</w:t>
+              <w:t xml:space="preserve">134</w:t>
             </w:r>
           </w:p>
         </w:tc>
@@ -34993,7 +35018,7 @@
                 <w:bCs/>
                 <w:b/>
               </w:rPr>
-              <w:t xml:space="preserve">4,635</w:t>
+              <w:t xml:space="preserve">4,713</w:t>
             </w:r>
           </w:p>
         </w:tc>
@@ -35008,7 +35033,7 @@
                 <w:bCs/>
                 <w:b/>
               </w:rPr>
-              <w:t xml:space="preserve">92.8%</w:t>
+              <w:t xml:space="preserve">94.3%</w:t>
             </w:r>
           </w:p>
         </w:tc>
@@ -35023,12 +35048,34 @@
                 <w:bCs/>
                 <w:b/>
               </w:rPr>
-              <w:t xml:space="preserve">86.6%</w:t>
+              <w:t xml:space="preserve">86.5%</w:t>
             </w:r>
           </w:p>
         </w:tc>
       </w:tr>
     </w:tbl>
+    <w:p>
+      <w:pPr>
+        <w:pStyle w:val="BodyText"/>
+      </w:pPr>
+      <w:r>
+        <w:t xml:space="preserve">coverage.py’s single combined figure (statements and branches together), which the CI gate checks</w:t>
+      </w:r>
+      <w:r>
+        <w:t xml:space="preserve"> </w:t>
+      </w:r>
+      <w:r>
+        <w:t xml:space="preserve">against 80%, is 92.9%.</w:t>
+      </w:r>
+    </w:p>
+    <w:p>
+      <w:pPr>
+        <w:pStyle w:val="BodyText"/>
+      </w:pPr>
+      <w:r>
+        <w:t xml:space="preserve">: Table 15.3 — Coverage by package (core packages in bold).</w:t>
+      </w:r>
+    </w:p>
     <w:p>
       <w:pPr>
         <w:pStyle w:val="BodyText"/>
@@ -36085,7 +36132,7 @@
               <w:jc w:val="left"/>
             </w:pPr>
             <w:r>
-              <w:t xml:space="preserve">92.8% coverage; complexity ≤ 10; strict typing; decision records; diagrams checked against code</w:t>
+              <w:t xml:space="preserve">94.3% statement and 86.5% branch coverage; complexity ≤ 10; strict typing; decision records; diagrams checked against code</w:t>
             </w:r>
           </w:p>
         </w:tc>
@@ -37115,7 +37162,7 @@
               <w:jc w:val="left"/>
             </w:pPr>
             <w:r>
-              <w:t xml:space="preserve">92.9–98.9% on the four core packages; 92.8% overall</w:t>
+              <w:t xml:space="preserve">92.6–98.9% on the four core packages; 94.3% overall (branches 86.5%)</w:t>
             </w:r>
           </w:p>
         </w:tc>
@@ -37964,6 +38011,73 @@
       </w:r>
       <w:r>
         <w:t xml:space="preserve">exists as a final status, but no action cancels a whole case.</w:t>
+      </w:r>
+    </w:p>
+    <w:p>
+      <w:pPr>
+        <w:numPr>
+          <w:ilvl w:val="0"/>
+          <w:numId w:val="1045"/>
+        </w:numPr>
+        <w:pStyle w:val="Compact"/>
+      </w:pPr>
+      <w:r>
+        <w:rPr>
+          <w:bCs/>
+          <w:b/>
+        </w:rPr>
+        <w:t xml:space="preserve">Smaller plan items.</w:t>
+      </w:r>
+      <w:r>
+        <w:t xml:space="preserve"> </w:t>
+      </w:r>
+      <w:r>
+        <w:t xml:space="preserve">The final audit (</w:t>
+      </w:r>
+      <w:r>
+        <w:rPr>
+          <w:rStyle w:val="VerbatimChar"/>
+        </w:rPr>
+        <w:t xml:space="preserve">docs/closure/acceptance.md</w:t>
+      </w:r>
+      <w:r>
+        <w:t xml:space="preserve">) found plan items no story</w:t>
+      </w:r>
+      <w:r>
+        <w:t xml:space="preserve"> </w:t>
+      </w:r>
+      <w:r>
+        <w:t xml:space="preserve">covered. Five were then built (decision 0009): structured JSON logs with case ids, HTTPS at the</w:t>
+      </w:r>
+      <w:r>
+        <w:t xml:space="preserve"> </w:t>
+      </w:r>
+      <w:r>
+        <w:t xml:space="preserve">web server, Grafana, the simulator’s urgency mix from the training data, and Playwright browser</w:t>
+      </w:r>
+      <w:r>
+        <w:t xml:space="preserve"> </w:t>
+      </w:r>
+      <w:r>
+        <w:t xml:space="preserve">tests. HTTPS and Grafana are configured and tested for consistency but, like all Docker parts,</w:t>
+      </w:r>
+      <w:r>
+        <w:t xml:space="preserve"> </w:t>
+      </w:r>
+      <w:r>
+        <w:t xml:space="preserve">not seen running. Still missing: Testcontainers, per-sprint review videos and task boards. The</w:t>
+      </w:r>
+      <w:r>
+        <w:t xml:space="preserve"> </w:t>
+      </w:r>
+      <w:r>
+        <w:t xml:space="preserve">model is trained by a script rather than a notebook, and three REST routes carry other names than</w:t>
+      </w:r>
+      <w:r>
+        <w:t xml:space="preserve"> </w:t>
+      </w:r>
+      <w:r>
+        <w:t xml:space="preserve">in the plan’s table.</w:t>
       </w:r>
     </w:p>
     <w:bookmarkEnd w:id="193"/>
@@ -43498,7 +43612,7 @@
               <w:jc w:val="right"/>
             </w:pPr>
             <w:r>
-              <w:t xml:space="preserve">5 (gateway, service-metrics)</w:t>
+              <w:t xml:space="preserve">7 (gateway, service-metrics, tests/scripts/test_monitoring_config.py)</w:t>
             </w:r>
           </w:p>
         </w:tc>
@@ -45102,7 +45216,7 @@
         <w:pStyle w:val="BodyText"/>
       </w:pPr>
       <w:r>
-        <w:t xml:space="preserve">Tests in the repository: 271 test functions (parametrised cases counted once).</w:t>
+        <w:t xml:space="preserve">Tests in the repository: 280 test functions (parametrised cases counted once).</w:t>
       </w:r>
       <w:r>
         <w:t xml:space="preserve"> </w:t>
@@ -49742,6 +49856,41 @@
           </w:p>
         </w:tc>
       </w:tr>
+      <w:tr>
+        <w:tc>
+          <w:p>
+            <w:pPr>
+              <w:pStyle w:val="Compact"/>
+              <w:jc w:val="left"/>
+            </w:pPr>
+            <w:r>
+              <w:t xml:space="preserve">0009</w:t>
+            </w:r>
+          </w:p>
+        </w:tc>
+        <w:tc>
+          <w:p>
+            <w:pPr>
+              <w:pStyle w:val="Compact"/>
+              <w:jc w:val="left"/>
+            </w:pPr>
+            <w:r>
+              <w:t xml:space="preserve">Closure additions: structured logs, HTTPS, Grafana, the urgency mix, browser tests</w:t>
+            </w:r>
+          </w:p>
+        </w:tc>
+        <w:tc>
+          <w:p>
+            <w:pPr>
+              <w:pStyle w:val="Compact"/>
+              <w:jc w:val="left"/>
+            </w:pPr>
+            <w:r>
+              <w:t xml:space="preserve">Closure</w:t>
+            </w:r>
+          </w:p>
+        </w:tc>
+      </w:tr>
     </w:tbl>
     <w:p>
       <w:pPr>
@@ -49764,7 +49913,7 @@
       </w:r>
     </w:p>
     <w:bookmarkEnd w:id="215"/>
-    <w:bookmarkStart w:id="226" w:name="appendix-d-prompt-log-excerpts"/>
+    <w:bookmarkStart w:id="228" w:name="appendix-d-prompt-log-excerpts"/>
     <w:p>
       <w:pPr>
         <w:pStyle w:val="Heading1"/>
@@ -50387,7 +50536,7 @@
     </w:p>
     <w:bookmarkEnd w:id="220"/>
     <w:bookmarkEnd w:id="221"/>
-    <w:bookmarkStart w:id="225" w:name="prompt-log-closure"/>
+    <w:bookmarkStart w:id="227" w:name="prompt-log-closure"/>
     <w:p>
       <w:pPr>
         <w:pStyle w:val="Heading2"/>
@@ -50760,7 +50909,100 @@
       </w:r>
     </w:p>
     <w:bookmarkEnd w:id="223"/>
-    <w:bookmarkStart w:id="224" w:name="not-done-needs-the-author"/>
+    <w:bookmarkStart w:id="224" w:name="final-audit"/>
+    <w:p>
+      <w:pPr>
+        <w:pStyle w:val="Heading3"/>
+      </w:pPr>
+      <w:r>
+        <w:t xml:space="preserve">Final audit</w:t>
+      </w:r>
+    </w:p>
+    <w:p>
+      <w:pPr>
+        <w:pStyle w:val="FirstParagraph"/>
+      </w:pPr>
+      <w:r>
+        <w:t xml:space="preserve">A last pass over the whole plan, with a fresh clone (639 tests pass), the full static gate, and a live</w:t>
+      </w:r>
+      <w:r>
+        <w:t xml:space="preserve"> </w:t>
+      </w:r>
+      <w:r>
+        <w:t xml:space="preserve">end-to-end smoke test through the gateway. It found ten smaller plan items not delivered (listed in</w:t>
+      </w:r>
+      <w:r>
+        <w:t xml:space="preserve"> </w:t>
+      </w:r>
+      <w:r>
+        <w:rPr>
+          <w:rStyle w:val="VerbatimChar"/>
+        </w:rPr>
+        <w:t xml:space="preserve">docs/closure/acceptance.md</w:t>
+      </w:r>
+      <w:r>
+        <w:t xml:space="preserve">) and one demo problem: the seed did not restore the deadlock example</w:t>
+      </w:r>
+      <w:r>
+        <w:t xml:space="preserve"> </w:t>
+      </w:r>
+      <w:r>
+        <w:t xml:space="preserve">after an earlier review had fixed it. The seed now resets it.</w:t>
+      </w:r>
+    </w:p>
+    <w:bookmarkEnd w:id="224"/>
+    <w:bookmarkStart w:id="225" w:name="closure-additions-decision-0009"/>
+    <w:p>
+      <w:pPr>
+        <w:pStyle w:val="Heading3"/>
+      </w:pPr>
+      <w:r>
+        <w:t xml:space="preserve">Closure additions (decision 0009)</w:t>
+      </w:r>
+    </w:p>
+    <w:p>
+      <w:pPr>
+        <w:pStyle w:val="FirstParagraph"/>
+      </w:pPr>
+      <w:r>
+        <w:t xml:space="preserve">Built after the audit, on request: structured JSON logs with case ids (</w:t>
+      </w:r>
+      <w:r>
+        <w:rPr>
+          <w:rStyle w:val="VerbatimChar"/>
+        </w:rPr>
+        <w:t xml:space="preserve">service_metrics.logs</w:t>
+      </w:r>
+      <w:r>
+        <w:t xml:space="preserve">;</w:t>
+      </w:r>
+      <w:r>
+        <w:t xml:space="preserve"> </w:t>
+      </w:r>
+      <w:r>
+        <w:t xml:space="preserve">seen in the dev stack), HTTPS at nginx (generated certificate; script tested locally, server not</w:t>
+      </w:r>
+      <w:r>
+        <w:t xml:space="preserve"> </w:t>
+      </w:r>
+      <w:r>
+        <w:t xml:space="preserve">run), Grafana (provisioned dashboard; not run), the simulator’s urgency mix from the training data,</w:t>
+      </w:r>
+      <w:r>
+        <w:t xml:space="preserve"> </w:t>
+      </w:r>
+      <w:r>
+        <w:t xml:space="preserve">and Playwright browser tests (3, passing twice in a row against the dev stack in Chrome).</w:t>
+      </w:r>
+      <w:r>
+        <w:t xml:space="preserve"> </w:t>
+      </w:r>
+      <w:r>
+        <w:t xml:space="preserve">Tests check the HTTPS and monitoring configuration against the code, since Docker is missing.</w:t>
+      </w:r>
+    </w:p>
+    <w:bookmarkEnd w:id="225"/>
+    <w:bookmarkStart w:id="226" w:name="not-done-needs-the-author"/>
     <w:p>
       <w:pPr>
         <w:pStyle w:val="Heading3"/>
@@ -50817,10 +51059,10 @@
         <w:t xml:space="preserve">The alpha test, the Docker run, the rehearsals and the backup video.</w:t>
       </w:r>
     </w:p>
-    <w:bookmarkEnd w:id="224"/>
-    <w:bookmarkEnd w:id="225"/>
     <w:bookmarkEnd w:id="226"/>
-    <w:bookmarkStart w:id="231" w:name="appendix-e-model-card"/>
+    <w:bookmarkEnd w:id="227"/>
+    <w:bookmarkEnd w:id="228"/>
+    <w:bookmarkStart w:id="233" w:name="appendix-e-model-card"/>
     <w:p>
       <w:pPr>
         <w:pStyle w:val="Heading1"/>
@@ -50829,7 +51071,7 @@
         <w:t xml:space="preserve">Appendix E — Model card</w:t>
       </w:r>
     </w:p>
-    <w:bookmarkStart w:id="230" w:name="model-card-urgency-v1-synthetic"/>
+    <w:bookmarkStart w:id="232" w:name="model-card-urgency-v1-synthetic"/>
     <w:p>
       <w:pPr>
         <w:pStyle w:val="Heading2"/>
@@ -51010,7 +51252,7 @@
         <w:t xml:space="preserve">Features: age, male, arrival_ambulance, arrival_referral, mental, pain, sbp, hr, rr, temp, spo2, kw_chest, kw_breath, kw_abdomen, kw_fever, kw_trauma, kw_neuro</w:t>
       </w:r>
     </w:p>
-    <w:bookmarkStart w:id="227" w:name="cross-validation-5-fold-training-set"/>
+    <w:bookmarkStart w:id="229" w:name="cross-validation-5-fold-training-set"/>
     <w:p>
       <w:pPr>
         <w:pStyle w:val="Heading3"/>
@@ -51211,8 +51453,8 @@
         </w:tc>
       </w:tr>
     </w:tbl>
-    <w:bookmarkEnd w:id="227"/>
-    <w:bookmarkStart w:id="228" w:name="held-out-test-set"/>
+    <w:bookmarkEnd w:id="229"/>
+    <w:bookmarkStart w:id="230" w:name="held-out-test-set"/>
     <w:p>
       <w:pPr>
         <w:pStyle w:val="Heading3"/>
@@ -52183,8 +52425,8 @@
         </w:tc>
       </w:tr>
     </w:tbl>
-    <w:bookmarkEnd w:id="228"/>
-    <w:bookmarkStart w:id="229" w:name="explanations"/>
+    <w:bookmarkEnd w:id="230"/>
+    <w:bookmarkStart w:id="231" w:name="explanations"/>
     <w:p>
       <w:pPr>
         <w:pStyle w:val="Heading3"/>
@@ -52207,9 +52449,9 @@
         <w:t xml:space="preserve">the uncalibrated logistic_regression).</w:t>
       </w:r>
     </w:p>
-    <w:bookmarkEnd w:id="229"/>
-    <w:bookmarkEnd w:id="230"/>
     <w:bookmarkEnd w:id="231"/>
+    <w:bookmarkEnd w:id="232"/>
+    <w:bookmarkEnd w:id="233"/>
     <w:sectPr/>
   </w:body>
 </w:document>

</xml_diff>

<commit_message>
SIM-05: count the target share as lower-is-better in run comparisons
A target metric is the share of patients who waited longer than the target's
limit, so a smaller share is the better result. The comparison treated it as
higher-is-better and called the worse run better (2 vs 4 nurses: 1% vs 0%
was reported as "#A better"). The row is now labelled "Beyond the target
limit" instead of "Target met". The report's description of the rule is
corrected and the report rebuilt.

Co-Authored-By: Claude Opus 5.5 <noreply@anthropic.com>
</commit_message>
<xml_diff>
--- a/docs/report/AdaptiveCare-Flow-Report.docx
+++ b/docs/report/AdaptiveCare-Flow-Report.docx
@@ -31100,7 +31100,13 @@
         <w:t xml:space="preserve"> </w:t>
       </w:r>
       <w:r>
-        <w:t xml:space="preserve">better is known per metric (waits lower, targets met higher, utilisation neither). The changed</w:t>
+        <w:t xml:space="preserve">better is known per metric (waits and the share of patients beyond a target’s limit lower,</w:t>
+      </w:r>
+      <w:r>
+        <w:t xml:space="preserve"> </w:t>
+      </w:r>
+      <w:r>
+        <w:t xml:space="preserve">patients completed higher, utilisation neither). The changed</w:t>
       </w:r>
       <w:r>
         <w:t xml:space="preserve"> </w:t>

</xml_diff>